<commit_message>
feat: adicionar listagem e filtro de cidades do Ceara
</commit_message>
<xml_diff>
--- a/public/generated-docs/Solicitação_de_Compartilhamento.docx
+++ b/public/generated-docs/Solicitação_de_Compartilhamento.docx
@@ -17,7 +17,7 @@
           <w:sz w:val="20"/>
           <w:szCs w:val="20"/>
         </w:rPr>
-        <w:t xml:space="preserve">Carnaubal</w:t>
+        <w:t xml:space="preserve">Guaraciaba</w:t>
       </w:r>
       <w:r>
         <w:rPr>
@@ -33,7 +33,7 @@
           <w:sz w:val="20"/>
           <w:szCs w:val="20"/>
         </w:rPr>
-        <w:t xml:space="preserve">29 de janeiro de 2026</w:t>
+        <w:t xml:space="preserve">17 de abril de 2026</w:t>
       </w:r>
     </w:p>
     <w:p>
@@ -461,7 +461,7 @@
           <w:sz w:val="20"/>
           <w:szCs w:val="20"/>
         </w:rPr>
-        <w:t xml:space="preserve"> emanuel@fibermax.net.br</w:t>
+        <w:t xml:space="preserve"> inforlinkreriutaba@gmail.com</w:t>
       </w:r>
       <w:r>
         <w:rPr>
@@ -477,7 +477,7 @@
           <w:sz w:val="20"/>
           <w:szCs w:val="20"/>
         </w:rPr>
-        <w:t xml:space="preserve"> EMANUEL MAGALHAES CUNHA</w:t>
+        <w:t xml:space="preserve"> JULIANA DE MEDEIROS ABREU MARINHO</w:t>
       </w:r>
       <w:r>
         <w:rPr>
@@ -509,7 +509,7 @@
           <w:sz w:val="20"/>
           <w:szCs w:val="20"/>
         </w:rPr>
-        <w:t xml:space="preserve">Rua Assembleia de Deus, 773 - Centro, Tianguá-CE, CEP: 62.320-029</w:t>
+        <w:t xml:space="preserve">AV DRA. LUIZA HELENA CAMELO PAIVA, 159, RAMPA - RERIUTABA CE - CEP: 62.260-000</w:t>
       </w:r>
       <w:r>
         <w:rPr>
@@ -608,7 +608,7 @@
           <w:sz w:val="20"/>
           <w:szCs w:val="20"/>
         </w:rPr>
-        <w:t xml:space="preserve">EMANUEL MAGALHAES CUNHA</w:t>
+        <w:t xml:space="preserve">JULIANA DE MEDEIROS ABREU MARINHO</w:t>
       </w:r>
     </w:p>
     <w:p>
@@ -646,7 +646,7 @@
           <w:sz w:val="20"/>
           <w:szCs w:val="20"/>
         </w:rPr>
-        <w:t xml:space="preserve">FIBER MAX SERVICOS DE TELECOMUNICACAO LTDA</w:t>
+        <w:t xml:space="preserve">INFORLINK FIBRA OPTICA LTDA</w:t>
       </w:r>
     </w:p>
     <w:p>
@@ -673,7 +673,7 @@
           <w:sz w:val="20"/>
           <w:szCs w:val="20"/>
         </w:rPr>
-        <w:t xml:space="preserve"> 06.207.579/0001-44</w:t>
+        <w:t xml:space="preserve"> 28.149.940/0001-66</w:t>
       </w:r>
     </w:p>
     <w:sectPr>

</xml_diff>